<commit_message>
Implementando ajustes de README e docs
</commit_message>
<xml_diff>
--- a/docs/Relatorio-Hackathon-SUS.docx
+++ b/docs/Relatorio-Hackathon-SUS.docx
@@ -140,6 +140,22 @@
     </w:p>
     <w:p>
       <w:pPr>
+        <w:spacing w:after="60" w:line="360"/>
+        <w:jc w:val="center"/>
+      </w:pPr>
+      <w:r>
+        <w:rPr>
+          <w:rFonts w:ascii="Arial" w:cs="Arial" w:eastAsia="Arial" w:hAnsi="Arial"/>
+          <w:b/>
+          <w:bCs/>
+          <w:sz w:val="24"/>
+          <w:szCs w:val="24"/>
+        </w:rPr>
+        <w:t xml:space="preserve">GIOVANA LEITE SCALABRINI</w:t>
+      </w:r>
+    </w:p>
+    <w:p>
+      <w:pPr>
         <w:spacing w:after="0" w:line="360"/>
         <w:jc w:val="center"/>
       </w:pPr>
@@ -151,10 +167,9 @@
           <w:sz w:val="24"/>
           <w:szCs w:val="24"/>
         </w:rPr>
-        <w:t xml:space="preserve">EQUIPE 9ADJT</w:t>
-      </w:r>
-    </w:p>
-    <w:p/>
+        <w:t xml:space="preserve">ALECIO SILVEIRA ARAÚJO</w:t>
+      </w:r>
+    </w:p>
     <w:p/>
     <w:p/>
     <w:p/>
@@ -211,7 +226,6 @@
         <w:t xml:space="preserve">Relatório técnico apresentado como requisito de avaliação da Fase 5 (Hackathon) do curso de Pós-graduação em Arquitetura e Desenvolvimento Java da FIAP, sob o tema “Inovação para otimização de atendimento no SUS”.</w:t>
       </w:r>
     </w:p>
-    <w:p/>
     <w:p/>
     <w:p/>
     <w:p/>
@@ -2018,7 +2032,7 @@
           <w:sz w:val="24"/>
           <w:szCs w:val="24"/>
         </w:rPr>
-        <w:t xml:space="preserve">testes automatizados sobre a regra de classificação de risco e a carga de contexto da aplicação (executando em banco H2).</w:t>
+        <w:t xml:space="preserve">testes unitários (JUnit 5 e Mockito) cobrindo todos os serviços de aplicação — Auth, Paciente, Unidade, Triagem, Fila, Consulta, Lista de Espera e Dashboard — além da regra de classificação de risco, executados em banco H2.</w:t>
       </w:r>
     </w:p>
     <w:p>
@@ -2039,6 +2053,35 @@
           <w:sz w:val="24"/>
           <w:szCs w:val="24"/>
         </w:rPr>
+        <w:t xml:space="preserve">Containerização e deploy: </w:t>
+      </w:r>
+      <w:r>
+        <w:rPr>
+          <w:rFonts w:ascii="Arial" w:cs="Arial" w:eastAsia="Arial" w:hAnsi="Arial"/>
+          <w:sz w:val="24"/>
+          <w:szCs w:val="24"/>
+        </w:rPr>
+        <w:t xml:space="preserve">empacotamento da aplicação e do MySQL em containers (Docker e Docker Compose) e automação da subida do ambiente por meio do script de deploy.</w:t>
+      </w:r>
+    </w:p>
+    <w:p>
+      <w:pPr>
+        <w:pStyle w:val="ListParagraph"/>
+        <w:numPr>
+          <w:ilvl w:val="0"/>
+          <w:numId w:val="3"/>
+        </w:numPr>
+        <w:spacing w:after="80" w:line="360"/>
+        <w:jc w:val="both"/>
+      </w:pPr>
+      <w:r>
+        <w:rPr>
+          <w:rFonts w:ascii="Arial" w:cs="Arial" w:eastAsia="Arial" w:hAnsi="Arial"/>
+          <w:b/>
+          <w:bCs/>
+          <w:sz w:val="24"/>
+          <w:szCs w:val="24"/>
+        </w:rPr>
         <w:t xml:space="preserve">Documentação: </w:t>
       </w:r>
       <w:r>
@@ -2260,7 +2303,36 @@
           <w:sz w:val="24"/>
           <w:szCs w:val="24"/>
         </w:rPr>
-        <w:t xml:space="preserve">Build: </w:t>
+        <w:t xml:space="preserve">Testes: </w:t>
+      </w:r>
+      <w:r>
+        <w:rPr>
+          <w:rFonts w:ascii="Arial" w:cs="Arial" w:eastAsia="Arial" w:hAnsi="Arial"/>
+          <w:sz w:val="24"/>
+          <w:szCs w:val="24"/>
+        </w:rPr>
+        <w:t xml:space="preserve">JUnit 5, Mockito e AssertJ.</w:t>
+      </w:r>
+    </w:p>
+    <w:p>
+      <w:pPr>
+        <w:pStyle w:val="ListParagraph"/>
+        <w:numPr>
+          <w:ilvl w:val="0"/>
+          <w:numId w:val="2"/>
+        </w:numPr>
+        <w:spacing w:after="80" w:line="360"/>
+        <w:jc w:val="both"/>
+      </w:pPr>
+      <w:r>
+        <w:rPr>
+          <w:rFonts w:ascii="Arial" w:cs="Arial" w:eastAsia="Arial" w:hAnsi="Arial"/>
+          <w:b/>
+          <w:bCs/>
+          <w:sz w:val="24"/>
+          <w:szCs w:val="24"/>
+        </w:rPr>
+        <w:t xml:space="preserve">Build e empacotamento: </w:t>
       </w:r>
       <w:r>
         <w:rPr>
@@ -2269,6 +2341,35 @@
           <w:szCs w:val="24"/>
         </w:rPr>
         <w:t xml:space="preserve">Maven (com wrapper mvnw).</w:t>
+      </w:r>
+    </w:p>
+    <w:p>
+      <w:pPr>
+        <w:pStyle w:val="ListParagraph"/>
+        <w:numPr>
+          <w:ilvl w:val="0"/>
+          <w:numId w:val="2"/>
+        </w:numPr>
+        <w:spacing w:after="80" w:line="360"/>
+        <w:jc w:val="both"/>
+      </w:pPr>
+      <w:r>
+        <w:rPr>
+          <w:rFonts w:ascii="Arial" w:cs="Arial" w:eastAsia="Arial" w:hAnsi="Arial"/>
+          <w:b/>
+          <w:bCs/>
+          <w:sz w:val="24"/>
+          <w:szCs w:val="24"/>
+        </w:rPr>
+        <w:t xml:space="preserve">Containerização: </w:t>
+      </w:r>
+      <w:r>
+        <w:rPr>
+          <w:rFonts w:ascii="Arial" w:cs="Arial" w:eastAsia="Arial" w:hAnsi="Arial"/>
+          <w:sz w:val="24"/>
+          <w:szCs w:val="24"/>
+        </w:rPr>
+        <w:t xml:space="preserve">Docker e Docker Compose (API e MySQL).</w:t>
       </w:r>
     </w:p>
     <w:p>
@@ -2573,6 +2674,48 @@
     </w:p>
     <w:p>
       <w:pPr>
+        <w:spacing w:after="160" w:line="360"/>
+        <w:jc w:val="both"/>
+      </w:pPr>
+      <w:r>
+        <w:rPr>
+          <w:rFonts w:ascii="Arial" w:cs="Arial" w:eastAsia="Arial" w:hAnsi="Arial"/>
+          <w:b/>
+          <w:bCs/>
+          <w:sz w:val="24"/>
+          <w:szCs w:val="24"/>
+        </w:rPr>
+        <w:t xml:space="preserve">Execução e deploy. </w:t>
+      </w:r>
+      <w:r>
+        <w:rPr>
+          <w:rFonts w:ascii="Arial" w:cs="Arial" w:eastAsia="Arial" w:hAnsi="Arial"/>
+          <w:sz w:val="24"/>
+          <w:szCs w:val="24"/>
+        </w:rPr>
+        <w:t xml:space="preserve">O ambiente sobe com um único comando, </w:t>
+      </w:r>
+      <w:r>
+        <w:rPr>
+          <w:rFonts w:ascii="Arial" w:cs="Arial" w:eastAsia="Arial" w:hAnsi="Arial"/>
+          <w:b/>
+          <w:bCs/>
+          <w:sz w:val="24"/>
+          <w:szCs w:val="24"/>
+        </w:rPr>
+        <w:t xml:space="preserve">./deploy.sh</w:t>
+      </w:r>
+      <w:r>
+        <w:rPr>
+          <w:rFonts w:ascii="Arial" w:cs="Arial" w:eastAsia="Arial" w:hAnsi="Arial"/>
+          <w:sz w:val="24"/>
+          <w:szCs w:val="24"/>
+        </w:rPr>
+        <w:t xml:space="preserve">, que executa duas etapas encadeadas: (1) build e testes via mvn clean install; e (2) construção das imagens e subida dos containers (API e MySQL) com Docker Compose, seguida de um health check da API. A porta 3306 deve estar livre antes da execução, pois é utilizada pelo container do MySQL. Após a subida, a API fica disponível em http://localhost:8080/api/v1, com a documentação interativa no Swagger UI.</w:t>
+      </w:r>
+    </w:p>
+    <w:p>
+      <w:pPr>
         <w:pStyle w:val="Heading1"/>
         <w:spacing w:after="160" w:before="240" w:line="360"/>
       </w:pPr>
@@ -2608,7 +2751,7 @@
         </w:rPr>
         <w:t xml:space="preserve">Repositório de código (GitHub): </w:t>
       </w:r>
-      <w:hyperlink w:history="1" r:id="rIdrgcb-ot3kr6kyv-kfe4mv">
+      <w:hyperlink w:history="1" r:id="rId2gdfjbseohhlu50umcgsa">
         <w:r>
           <w:rPr>
             <w:rStyle w:val="Hyperlink"/>
@@ -2640,7 +2783,7 @@
         </w:rPr>
         <w:t xml:space="preserve">Vídeo do pitch (YouTube, 8 minutos): </w:t>
       </w:r>
-      <w:hyperlink w:history="1" r:id="rIdfxoztl7jx13ug3kv4-mus">
+      <w:hyperlink w:history="1" r:id="rIdr_oztiivaqx9ikyn99vt2">
         <w:r>
           <w:rPr>
             <w:rStyle w:val="Hyperlink"/>
@@ -2856,15 +2999,15 @@
           <w:sz w:val="24"/>
           <w:szCs w:val="24"/>
         </w:rPr>
-        <w:t xml:space="preserve">Valor de pequenas automações: </w:t>
-      </w:r>
-      <w:r>
-        <w:rPr>
-          <w:rFonts w:ascii="Arial" w:cs="Arial" w:eastAsia="Arial" w:hAnsi="Arial"/>
-          <w:sz w:val="24"/>
-          <w:szCs w:val="24"/>
-        </w:rPr>
-        <w:t xml:space="preserve">o reagendamento automático a partir do cancelamento mostrou como uma regra simples gera impacto real no aproveitamento de vagas.</w:t>
+        <w:t xml:space="preserve">Automação de build e deploy: </w:t>
+      </w:r>
+      <w:r>
+        <w:rPr>
+          <w:rFonts w:ascii="Arial" w:cs="Arial" w:eastAsia="Arial" w:hAnsi="Arial"/>
+          <w:sz w:val="24"/>
+          <w:szCs w:val="24"/>
+        </w:rPr>
+        <w:t xml:space="preserve">a containerização e o script de deploy tornaram a execução do projeto reproduzível em qualquer ambiente com um único comando.</w:t>
       </w:r>
     </w:p>
     <w:p>
@@ -2881,44 +3024,6 @@
           <w:szCs w:val="24"/>
         </w:rPr>
         <w:t xml:space="preserve">O que pode ser aprimorado no futuro:</w:t>
-      </w:r>
-    </w:p>
-    <w:p>
-      <w:pPr>
-        <w:pStyle w:val="ListParagraph"/>
-        <w:numPr>
-          <w:ilvl w:val="0"/>
-          <w:numId w:val="2"/>
-        </w:numPr>
-        <w:spacing w:after="80" w:line="360"/>
-        <w:jc w:val="both"/>
-      </w:pPr>
-      <w:r>
-        <w:rPr>
-          <w:rFonts w:ascii="Arial" w:cs="Arial" w:eastAsia="Arial" w:hAnsi="Arial"/>
-          <w:sz w:val="24"/>
-          <w:szCs w:val="24"/>
-        </w:rPr>
-        <w:t xml:space="preserve">Ampliar a cobertura de testes para os serviços de Consulta, Fila, Lista de Espera e Auth.</w:t>
-      </w:r>
-    </w:p>
-    <w:p>
-      <w:pPr>
-        <w:pStyle w:val="ListParagraph"/>
-        <w:numPr>
-          <w:ilvl w:val="0"/>
-          <w:numId w:val="2"/>
-        </w:numPr>
-        <w:spacing w:after="80" w:line="360"/>
-        <w:jc w:val="both"/>
-      </w:pPr>
-      <w:r>
-        <w:rPr>
-          <w:rFonts w:ascii="Arial" w:cs="Arial" w:eastAsia="Arial" w:hAnsi="Arial"/>
-          <w:sz w:val="24"/>
-          <w:szCs w:val="24"/>
-        </w:rPr>
-        <w:t xml:space="preserve">Adicionar Dockerfile e docker-compose (aplicação e MySQL) para facilitar execução e demonstração.</w:t>
       </w:r>
     </w:p>
     <w:p>

</xml_diff>